<commit_message>
Complete ASG Airlines Data Engineering & Business Intelligence Project
</commit_message>
<xml_diff>
--- a/ASG_Airlines_Project/docs/detailed.docx
+++ b/ASG_Airlines_Project/docs/detailed.docx
@@ -202,6 +202,27 @@
         <w:jc w:val="center"/>
         <w:rPr>
           <w:rFonts w:ascii="Times" w:hAnsi="Times"/>
+          <w:sz w:val="28"/>
+          <w:szCs w:val="28"/>
+        </w:rPr>
+      </w:pPr>
+      <w:hyperlink r:id="rId6" w:history="1">
+        <w:r>
+          <w:rPr>
+            <w:rStyle w:val="Hyperlink"/>
+            <w:rFonts w:ascii="Times" w:hAnsi="Times"/>
+            <w:sz w:val="28"/>
+            <w:szCs w:val="28"/>
+          </w:rPr>
+          <w:t>https://github.com/wahtaj465-dotcom/ASG_Airlines_Data_Engineering_Project</w:t>
+        </w:r>
+      </w:hyperlink>
+    </w:p>
+    <w:p>
+      <w:pPr>
+        <w:jc w:val="center"/>
+        <w:rPr>
+          <w:rFonts w:ascii="Times" w:hAnsi="Times"/>
           <w:sz w:val="56"/>
           <w:szCs w:val="56"/>
         </w:rPr>
@@ -264,7 +285,6 @@
           <w:sz w:val="32"/>
           <w:szCs w:val="32"/>
         </w:rPr>
-        <w:lastRenderedPageBreak/>
         <w:t>Abstract</w:t>
       </w:r>
     </w:p>
@@ -485,7 +505,6 @@
           <w:sz w:val="32"/>
           <w:szCs w:val="32"/>
         </w:rPr>
-        <w:lastRenderedPageBreak/>
         <w:t>1. INTRODUCTION</w:t>
       </w:r>
     </w:p>
@@ -507,9 +526,650 @@
           <w:sz w:val="32"/>
           <w:szCs w:val="32"/>
         </w:rPr>
-        <w:t xml:space="preserve">1.1 </w:t>
-      </w:r>
-      <w:r>
+        <w:t>1.1 Background</w:t>
+      </w:r>
+    </w:p>
+    <w:p>
+      <w:pPr>
+        <w:spacing w:line="360" w:lineRule="auto"/>
+        <w:jc w:val="both"/>
+        <w:rPr>
+          <w:rFonts w:ascii="Times New Roman" w:hAnsi="Times New Roman" w:cs="Times New Roman"/>
+          <w:sz w:val="28"/>
+          <w:szCs w:val="28"/>
+        </w:rPr>
+      </w:pPr>
+      <w:r>
+        <w:rPr>
+          <w:rFonts w:ascii="Times New Roman" w:hAnsi="Times New Roman" w:cs="Times New Roman"/>
+          <w:sz w:val="28"/>
+          <w:szCs w:val="28"/>
+        </w:rPr>
+        <w:t>The airline industry generates enormous volumes of operational and transactional data every day. Information related to flight schedules, bookings, passengers, ticket payments, airline performance, and travel routes contains valuable business intelligence that can help organizations improve customer satisfaction and operational efficiency.</w:t>
+      </w:r>
+    </w:p>
+    <w:p>
+      <w:pPr>
+        <w:spacing w:line="360" w:lineRule="auto"/>
+        <w:jc w:val="both"/>
+        <w:rPr>
+          <w:rFonts w:ascii="Times New Roman" w:hAnsi="Times New Roman" w:cs="Times New Roman"/>
+          <w:sz w:val="28"/>
+          <w:szCs w:val="28"/>
+        </w:rPr>
+      </w:pPr>
+      <w:r>
+        <w:rPr>
+          <w:rFonts w:ascii="Times New Roman" w:hAnsi="Times New Roman" w:cs="Times New Roman"/>
+          <w:sz w:val="28"/>
+          <w:szCs w:val="28"/>
+        </w:rPr>
+        <w:t>However, raw data alone cannot support strategic decisions because it often contains inconsistencies, duplicates, missing values, and multiple disconnected tables. Therefore, organizations require a structured data pipeline that transforms raw information into reliable analytical datasets.</w:t>
+      </w:r>
+    </w:p>
+    <w:p>
+      <w:pPr>
+        <w:spacing w:line="360" w:lineRule="auto"/>
+        <w:jc w:val="both"/>
+        <w:rPr>
+          <w:rFonts w:ascii="Times New Roman" w:hAnsi="Times New Roman" w:cs="Times New Roman"/>
+          <w:sz w:val="28"/>
+          <w:szCs w:val="28"/>
+        </w:rPr>
+      </w:pPr>
+      <w:r>
+        <w:rPr>
+          <w:rFonts w:ascii="Times New Roman" w:hAnsi="Times New Roman" w:cs="Times New Roman"/>
+          <w:sz w:val="28"/>
+          <w:szCs w:val="28"/>
+        </w:rPr>
+        <w:t>This project addresses that challenge by building an end-to-end analytics solution for ASG Airlines, integrating data engineering, SQL analytics, and Power BI visualization into a single workflow.</w:t>
+      </w:r>
+    </w:p>
+    <w:p>
+      <w:pPr>
+        <w:spacing w:line="360" w:lineRule="auto"/>
+        <w:jc w:val="both"/>
+        <w:rPr>
+          <w:rFonts w:ascii="Times New Roman" w:hAnsi="Times New Roman" w:cs="Times New Roman"/>
+          <w:sz w:val="28"/>
+          <w:szCs w:val="28"/>
+        </w:rPr>
+      </w:pPr>
+    </w:p>
+    <w:p>
+      <w:pPr>
+        <w:spacing w:line="360" w:lineRule="auto"/>
+        <w:jc w:val="both"/>
+        <w:rPr>
+          <w:rFonts w:ascii="Times New Roman" w:hAnsi="Times New Roman" w:cs="Times New Roman"/>
+          <w:b/>
+          <w:bCs/>
+          <w:sz w:val="28"/>
+          <w:szCs w:val="28"/>
+        </w:rPr>
+      </w:pPr>
+      <w:r>
+        <w:rPr>
+          <w:rFonts w:ascii="Times New Roman" w:hAnsi="Times New Roman" w:cs="Times New Roman"/>
+          <w:b/>
+          <w:bCs/>
+          <w:sz w:val="28"/>
+          <w:szCs w:val="28"/>
+        </w:rPr>
+        <w:t>1.2 Problem Statement</w:t>
+      </w:r>
+    </w:p>
+    <w:p>
+      <w:pPr>
+        <w:spacing w:line="360" w:lineRule="auto"/>
+        <w:jc w:val="both"/>
+        <w:rPr>
+          <w:rFonts w:ascii="Times New Roman" w:hAnsi="Times New Roman" w:cs="Times New Roman"/>
+          <w:sz w:val="28"/>
+          <w:szCs w:val="28"/>
+        </w:rPr>
+      </w:pPr>
+      <w:r>
+        <w:rPr>
+          <w:rFonts w:ascii="Times New Roman" w:hAnsi="Times New Roman" w:cs="Times New Roman"/>
+          <w:sz w:val="28"/>
+          <w:szCs w:val="28"/>
+        </w:rPr>
+        <w:t>The airline management team lacked a centralized analytical platform capable of answering critical business questions such as:</w:t>
+      </w:r>
+    </w:p>
+    <w:p>
+      <w:pPr>
+        <w:numPr>
+          <w:ilvl w:val="0"/>
+          <w:numId w:val="2"/>
+        </w:numPr>
+        <w:spacing w:line="360" w:lineRule="auto"/>
+        <w:jc w:val="both"/>
+        <w:rPr>
+          <w:rFonts w:ascii="Times New Roman" w:hAnsi="Times New Roman" w:cs="Times New Roman"/>
+          <w:sz w:val="28"/>
+          <w:szCs w:val="28"/>
+        </w:rPr>
+      </w:pPr>
+      <w:r>
+        <w:rPr>
+          <w:rFonts w:ascii="Times New Roman" w:hAnsi="Times New Roman" w:cs="Times New Roman"/>
+          <w:sz w:val="28"/>
+          <w:szCs w:val="28"/>
+        </w:rPr>
+        <w:t>Which airlines generate the highest revenue?</w:t>
+      </w:r>
+    </w:p>
+    <w:p>
+      <w:pPr>
+        <w:numPr>
+          <w:ilvl w:val="0"/>
+          <w:numId w:val="2"/>
+        </w:numPr>
+        <w:spacing w:line="360" w:lineRule="auto"/>
+        <w:jc w:val="both"/>
+        <w:rPr>
+          <w:rFonts w:ascii="Times New Roman" w:hAnsi="Times New Roman" w:cs="Times New Roman"/>
+          <w:sz w:val="28"/>
+          <w:szCs w:val="28"/>
+        </w:rPr>
+      </w:pPr>
+      <w:r>
+        <w:rPr>
+          <w:rFonts w:ascii="Times New Roman" w:hAnsi="Times New Roman" w:cs="Times New Roman"/>
+          <w:sz w:val="28"/>
+          <w:szCs w:val="28"/>
+        </w:rPr>
+        <w:t>What are the busiest departure cities?</w:t>
+      </w:r>
+    </w:p>
+    <w:p>
+      <w:pPr>
+        <w:numPr>
+          <w:ilvl w:val="0"/>
+          <w:numId w:val="2"/>
+        </w:numPr>
+        <w:spacing w:line="360" w:lineRule="auto"/>
+        <w:jc w:val="both"/>
+        <w:rPr>
+          <w:rFonts w:ascii="Times New Roman" w:hAnsi="Times New Roman" w:cs="Times New Roman"/>
+          <w:sz w:val="28"/>
+          <w:szCs w:val="28"/>
+        </w:rPr>
+      </w:pPr>
+      <w:r>
+        <w:rPr>
+          <w:rFonts w:ascii="Times New Roman" w:hAnsi="Times New Roman" w:cs="Times New Roman"/>
+          <w:sz w:val="28"/>
+          <w:szCs w:val="28"/>
+        </w:rPr>
+        <w:t>How does monthly revenue fluctuate?</w:t>
+      </w:r>
+    </w:p>
+    <w:p>
+      <w:pPr>
+        <w:numPr>
+          <w:ilvl w:val="0"/>
+          <w:numId w:val="2"/>
+        </w:numPr>
+        <w:spacing w:line="360" w:lineRule="auto"/>
+        <w:jc w:val="both"/>
+        <w:rPr>
+          <w:rFonts w:ascii="Times New Roman" w:hAnsi="Times New Roman" w:cs="Times New Roman"/>
+          <w:sz w:val="28"/>
+          <w:szCs w:val="28"/>
+        </w:rPr>
+      </w:pPr>
+      <w:r>
+        <w:rPr>
+          <w:rFonts w:ascii="Times New Roman" w:hAnsi="Times New Roman" w:cs="Times New Roman"/>
+          <w:sz w:val="28"/>
+          <w:szCs w:val="28"/>
+        </w:rPr>
+        <w:t>What is the passenger demographic distribution?</w:t>
+      </w:r>
+    </w:p>
+    <w:p>
+      <w:pPr>
+        <w:numPr>
+          <w:ilvl w:val="0"/>
+          <w:numId w:val="2"/>
+        </w:numPr>
+        <w:spacing w:line="360" w:lineRule="auto"/>
+        <w:jc w:val="both"/>
+        <w:rPr>
+          <w:rFonts w:ascii="Times New Roman" w:hAnsi="Times New Roman" w:cs="Times New Roman"/>
+          <w:sz w:val="28"/>
+          <w:szCs w:val="28"/>
+        </w:rPr>
+      </w:pPr>
+      <w:r>
+        <w:rPr>
+          <w:rFonts w:ascii="Times New Roman" w:hAnsi="Times New Roman" w:cs="Times New Roman"/>
+          <w:sz w:val="28"/>
+          <w:szCs w:val="28"/>
+        </w:rPr>
+        <w:t>What percentage of flights operate overnight?</w:t>
+      </w:r>
+    </w:p>
+    <w:p>
+      <w:pPr>
+        <w:numPr>
+          <w:ilvl w:val="0"/>
+          <w:numId w:val="2"/>
+        </w:numPr>
+        <w:spacing w:line="360" w:lineRule="auto"/>
+        <w:jc w:val="both"/>
+        <w:rPr>
+          <w:rFonts w:ascii="Times New Roman" w:hAnsi="Times New Roman" w:cs="Times New Roman"/>
+          <w:sz w:val="28"/>
+          <w:szCs w:val="28"/>
+        </w:rPr>
+      </w:pPr>
+      <w:r>
+        <w:rPr>
+          <w:rFonts w:ascii="Times New Roman" w:hAnsi="Times New Roman" w:cs="Times New Roman"/>
+          <w:sz w:val="28"/>
+          <w:szCs w:val="28"/>
+        </w:rPr>
+        <w:t>Which payment method contributes the most revenue?</w:t>
+      </w:r>
+    </w:p>
+    <w:p>
+      <w:pPr>
+        <w:spacing w:line="360" w:lineRule="auto"/>
+        <w:jc w:val="both"/>
+        <w:rPr>
+          <w:rFonts w:ascii="Times New Roman" w:hAnsi="Times New Roman" w:cs="Times New Roman"/>
+          <w:sz w:val="28"/>
+          <w:szCs w:val="28"/>
+        </w:rPr>
+      </w:pPr>
+      <w:r>
+        <w:rPr>
+          <w:rFonts w:ascii="Times New Roman" w:hAnsi="Times New Roman" w:cs="Times New Roman"/>
+          <w:sz w:val="28"/>
+          <w:szCs w:val="28"/>
+        </w:rPr>
+        <w:lastRenderedPageBreak/>
+        <w:t>Manual analysis using Excel was time-consuming and inefficient. Hence, an automated analytics platform was required.</w:t>
+      </w:r>
+    </w:p>
+    <w:p>
+      <w:pPr>
+        <w:spacing w:line="360" w:lineRule="auto"/>
+        <w:jc w:val="both"/>
+        <w:rPr>
+          <w:rFonts w:ascii="Times New Roman" w:hAnsi="Times New Roman" w:cs="Times New Roman"/>
+          <w:b/>
+          <w:bCs/>
+          <w:sz w:val="28"/>
+          <w:szCs w:val="28"/>
+        </w:rPr>
+      </w:pPr>
+    </w:p>
+    <w:p>
+      <w:pPr>
+        <w:spacing w:line="360" w:lineRule="auto"/>
+        <w:jc w:val="both"/>
+        <w:rPr>
+          <w:rFonts w:ascii="Times New Roman" w:hAnsi="Times New Roman" w:cs="Times New Roman"/>
+          <w:b/>
+          <w:bCs/>
+          <w:sz w:val="28"/>
+          <w:szCs w:val="28"/>
+        </w:rPr>
+      </w:pPr>
+      <w:r>
+        <w:rPr>
+          <w:rFonts w:ascii="Times New Roman" w:hAnsi="Times New Roman" w:cs="Times New Roman"/>
+          <w:b/>
+          <w:bCs/>
+          <w:sz w:val="28"/>
+          <w:szCs w:val="28"/>
+        </w:rPr>
+        <w:t>1.3 Project Objectives</w:t>
+      </w:r>
+    </w:p>
+    <w:p>
+      <w:pPr>
+        <w:spacing w:line="360" w:lineRule="auto"/>
+        <w:jc w:val="both"/>
+        <w:rPr>
+          <w:rFonts w:ascii="Times New Roman" w:hAnsi="Times New Roman" w:cs="Times New Roman"/>
+          <w:sz w:val="28"/>
+          <w:szCs w:val="28"/>
+        </w:rPr>
+      </w:pPr>
+      <w:r>
+        <w:rPr>
+          <w:rFonts w:ascii="Times New Roman" w:hAnsi="Times New Roman" w:cs="Times New Roman"/>
+          <w:sz w:val="28"/>
+          <w:szCs w:val="28"/>
+        </w:rPr>
+        <w:t>The primary objectives of this project are:</w:t>
+      </w:r>
+    </w:p>
+    <w:p>
+      <w:pPr>
+        <w:numPr>
+          <w:ilvl w:val="0"/>
+          <w:numId w:val="3"/>
+        </w:numPr>
+        <w:spacing w:line="360" w:lineRule="auto"/>
+        <w:jc w:val="both"/>
+        <w:rPr>
+          <w:rFonts w:ascii="Times New Roman" w:hAnsi="Times New Roman" w:cs="Times New Roman"/>
+          <w:sz w:val="28"/>
+          <w:szCs w:val="28"/>
+        </w:rPr>
+      </w:pPr>
+      <w:r>
+        <w:rPr>
+          <w:rFonts w:ascii="Times New Roman" w:hAnsi="Times New Roman" w:cs="Times New Roman"/>
+          <w:sz w:val="28"/>
+          <w:szCs w:val="28"/>
+        </w:rPr>
+        <w:t>Design an end-to-end ETL pipeline.</w:t>
+      </w:r>
+    </w:p>
+    <w:p>
+      <w:pPr>
+        <w:numPr>
+          <w:ilvl w:val="0"/>
+          <w:numId w:val="3"/>
+        </w:numPr>
+        <w:spacing w:line="360" w:lineRule="auto"/>
+        <w:jc w:val="both"/>
+        <w:rPr>
+          <w:rFonts w:ascii="Times New Roman" w:hAnsi="Times New Roman" w:cs="Times New Roman"/>
+          <w:sz w:val="28"/>
+          <w:szCs w:val="28"/>
+        </w:rPr>
+      </w:pPr>
+      <w:r>
+        <w:rPr>
+          <w:rFonts w:ascii="Times New Roman" w:hAnsi="Times New Roman" w:cs="Times New Roman"/>
+          <w:sz w:val="28"/>
+          <w:szCs w:val="28"/>
+        </w:rPr>
+        <w:t>Clean and validate airline datasets using Python.</w:t>
+      </w:r>
+    </w:p>
+    <w:p>
+      <w:pPr>
+        <w:numPr>
+          <w:ilvl w:val="0"/>
+          <w:numId w:val="3"/>
+        </w:numPr>
+        <w:spacing w:line="360" w:lineRule="auto"/>
+        <w:jc w:val="both"/>
+        <w:rPr>
+          <w:rFonts w:ascii="Times New Roman" w:hAnsi="Times New Roman" w:cs="Times New Roman"/>
+          <w:sz w:val="28"/>
+          <w:szCs w:val="28"/>
+        </w:rPr>
+      </w:pPr>
+      <w:r>
+        <w:rPr>
+          <w:rFonts w:ascii="Times New Roman" w:hAnsi="Times New Roman" w:cs="Times New Roman"/>
+          <w:sz w:val="28"/>
+          <w:szCs w:val="28"/>
+        </w:rPr>
+        <w:t>Build a normalized SQL database.</w:t>
+      </w:r>
+    </w:p>
+    <w:p>
+      <w:pPr>
+        <w:numPr>
+          <w:ilvl w:val="0"/>
+          <w:numId w:val="3"/>
+        </w:numPr>
+        <w:spacing w:line="360" w:lineRule="auto"/>
+        <w:jc w:val="both"/>
+        <w:rPr>
+          <w:rFonts w:ascii="Times New Roman" w:hAnsi="Times New Roman" w:cs="Times New Roman"/>
+          <w:sz w:val="28"/>
+          <w:szCs w:val="28"/>
+        </w:rPr>
+      </w:pPr>
+      <w:r>
+        <w:rPr>
+          <w:rFonts w:ascii="Times New Roman" w:hAnsi="Times New Roman" w:cs="Times New Roman"/>
+          <w:sz w:val="28"/>
+          <w:szCs w:val="28"/>
+        </w:rPr>
+        <w:t>Generate business KPIs using SQL and DAX.</w:t>
+      </w:r>
+    </w:p>
+    <w:p>
+      <w:pPr>
+        <w:numPr>
+          <w:ilvl w:val="0"/>
+          <w:numId w:val="3"/>
+        </w:numPr>
+        <w:spacing w:line="360" w:lineRule="auto"/>
+        <w:jc w:val="both"/>
+        <w:rPr>
+          <w:rFonts w:ascii="Times New Roman" w:hAnsi="Times New Roman" w:cs="Times New Roman"/>
+          <w:sz w:val="28"/>
+          <w:szCs w:val="28"/>
+        </w:rPr>
+      </w:pPr>
+      <w:r>
+        <w:rPr>
+          <w:rFonts w:ascii="Times New Roman" w:hAnsi="Times New Roman" w:cs="Times New Roman"/>
+          <w:sz w:val="28"/>
+          <w:szCs w:val="28"/>
+        </w:rPr>
+        <w:t xml:space="preserve">Implement Star Schema data </w:t>
+      </w:r>
+      <w:proofErr w:type="spellStart"/>
+      <w:r>
+        <w:rPr>
+          <w:rFonts w:ascii="Times New Roman" w:hAnsi="Times New Roman" w:cs="Times New Roman"/>
+          <w:sz w:val="28"/>
+          <w:szCs w:val="28"/>
+        </w:rPr>
+        <w:t>modeling</w:t>
+      </w:r>
+      <w:proofErr w:type="spellEnd"/>
+      <w:r>
+        <w:rPr>
+          <w:rFonts w:ascii="Times New Roman" w:hAnsi="Times New Roman" w:cs="Times New Roman"/>
+          <w:sz w:val="28"/>
+          <w:szCs w:val="28"/>
+        </w:rPr>
+        <w:t>.</w:t>
+      </w:r>
+    </w:p>
+    <w:p>
+      <w:pPr>
+        <w:numPr>
+          <w:ilvl w:val="0"/>
+          <w:numId w:val="3"/>
+        </w:numPr>
+        <w:spacing w:line="360" w:lineRule="auto"/>
+        <w:jc w:val="both"/>
+        <w:rPr>
+          <w:rFonts w:ascii="Times New Roman" w:hAnsi="Times New Roman" w:cs="Times New Roman"/>
+          <w:sz w:val="28"/>
+          <w:szCs w:val="28"/>
+        </w:rPr>
+      </w:pPr>
+      <w:r>
+        <w:rPr>
+          <w:rFonts w:ascii="Times New Roman" w:hAnsi="Times New Roman" w:cs="Times New Roman"/>
+          <w:sz w:val="28"/>
+          <w:szCs w:val="28"/>
+        </w:rPr>
+        <w:t>Develop interactive Power BI dashboards.</w:t>
+      </w:r>
+    </w:p>
+    <w:p>
+      <w:pPr>
+        <w:numPr>
+          <w:ilvl w:val="0"/>
+          <w:numId w:val="3"/>
+        </w:numPr>
+        <w:spacing w:line="360" w:lineRule="auto"/>
+        <w:jc w:val="both"/>
+        <w:rPr>
+          <w:rFonts w:ascii="Times New Roman" w:hAnsi="Times New Roman" w:cs="Times New Roman"/>
+          <w:sz w:val="28"/>
+          <w:szCs w:val="28"/>
+        </w:rPr>
+      </w:pPr>
+      <w:r>
+        <w:rPr>
+          <w:rFonts w:ascii="Times New Roman" w:hAnsi="Times New Roman" w:cs="Times New Roman"/>
+          <w:sz w:val="28"/>
+          <w:szCs w:val="28"/>
+        </w:rPr>
+        <w:t>Enable slicers, navigation, and drill-down analysis.</w:t>
+      </w:r>
+    </w:p>
+    <w:p>
+      <w:pPr>
+        <w:numPr>
+          <w:ilvl w:val="0"/>
+          <w:numId w:val="3"/>
+        </w:numPr>
+        <w:spacing w:line="360" w:lineRule="auto"/>
+        <w:jc w:val="both"/>
+        <w:rPr>
+          <w:rFonts w:ascii="Times New Roman" w:hAnsi="Times New Roman" w:cs="Times New Roman"/>
+          <w:sz w:val="28"/>
+          <w:szCs w:val="28"/>
+        </w:rPr>
+      </w:pPr>
+      <w:r>
+        <w:rPr>
+          <w:rFonts w:ascii="Times New Roman" w:hAnsi="Times New Roman" w:cs="Times New Roman"/>
+          <w:sz w:val="28"/>
+          <w:szCs w:val="28"/>
+        </w:rPr>
+        <w:t>Produce executive-level business reports for decision making.</w:t>
+      </w:r>
+    </w:p>
+    <w:p>
+      <w:pPr>
+        <w:spacing w:line="360" w:lineRule="auto"/>
+        <w:jc w:val="both"/>
+        <w:rPr>
+          <w:rFonts w:ascii="Times New Roman" w:hAnsi="Times New Roman" w:cs="Times New Roman"/>
+          <w:sz w:val="28"/>
+          <w:szCs w:val="28"/>
+        </w:rPr>
+      </w:pPr>
+    </w:p>
+    <w:p>
+      <w:pPr>
+        <w:spacing w:line="360" w:lineRule="auto"/>
+        <w:jc w:val="both"/>
+        <w:rPr>
+          <w:rFonts w:ascii="Times New Roman" w:hAnsi="Times New Roman" w:cs="Times New Roman"/>
+          <w:sz w:val="28"/>
+          <w:szCs w:val="28"/>
+        </w:rPr>
+      </w:pPr>
+    </w:p>
+    <w:p>
+      <w:pPr>
+        <w:spacing w:line="360" w:lineRule="auto"/>
+        <w:jc w:val="both"/>
+        <w:rPr>
+          <w:rFonts w:ascii="Times New Roman" w:hAnsi="Times New Roman" w:cs="Times New Roman"/>
+          <w:sz w:val="28"/>
+          <w:szCs w:val="28"/>
+        </w:rPr>
+      </w:pPr>
+    </w:p>
+    <w:p>
+      <w:pPr>
+        <w:spacing w:line="360" w:lineRule="auto"/>
+        <w:jc w:val="both"/>
+        <w:rPr>
+          <w:rFonts w:ascii="Times New Roman" w:hAnsi="Times New Roman" w:cs="Times New Roman"/>
+          <w:sz w:val="28"/>
+          <w:szCs w:val="28"/>
+        </w:rPr>
+      </w:pPr>
+    </w:p>
+    <w:p>
+      <w:pPr>
+        <w:spacing w:line="360" w:lineRule="auto"/>
+        <w:jc w:val="both"/>
+        <w:rPr>
+          <w:rFonts w:ascii="Times New Roman" w:hAnsi="Times New Roman" w:cs="Times New Roman"/>
+          <w:sz w:val="28"/>
+          <w:szCs w:val="28"/>
+        </w:rPr>
+      </w:pPr>
+    </w:p>
+    <w:p>
+      <w:pPr>
+        <w:spacing w:line="360" w:lineRule="auto"/>
+        <w:jc w:val="both"/>
+        <w:rPr>
+          <w:rFonts w:ascii="Times New Roman" w:hAnsi="Times New Roman" w:cs="Times New Roman"/>
+          <w:sz w:val="28"/>
+          <w:szCs w:val="28"/>
+        </w:rPr>
+      </w:pPr>
+    </w:p>
+    <w:p>
+      <w:pPr>
+        <w:spacing w:line="360" w:lineRule="auto"/>
+        <w:jc w:val="both"/>
+        <w:rPr>
+          <w:rFonts w:ascii="Times New Roman" w:hAnsi="Times New Roman" w:cs="Times New Roman"/>
+          <w:sz w:val="28"/>
+          <w:szCs w:val="28"/>
+        </w:rPr>
+      </w:pPr>
+    </w:p>
+    <w:p>
+      <w:pPr>
+        <w:spacing w:line="360" w:lineRule="auto"/>
+        <w:jc w:val="both"/>
+        <w:rPr>
+          <w:rFonts w:ascii="Times New Roman" w:hAnsi="Times New Roman" w:cs="Times New Roman"/>
+          <w:sz w:val="28"/>
+          <w:szCs w:val="28"/>
+        </w:rPr>
+      </w:pPr>
+    </w:p>
+    <w:p>
+      <w:pPr>
+        <w:spacing w:line="360" w:lineRule="auto"/>
+        <w:jc w:val="both"/>
+        <w:rPr>
+          <w:rFonts w:ascii="Times New Roman" w:hAnsi="Times New Roman" w:cs="Times New Roman"/>
+          <w:sz w:val="28"/>
+          <w:szCs w:val="28"/>
+        </w:rPr>
+      </w:pPr>
+    </w:p>
+    <w:p>
+      <w:pPr>
+        <w:spacing w:line="360" w:lineRule="auto"/>
+        <w:jc w:val="both"/>
+        <w:rPr>
+          <w:rFonts w:ascii="Times New Roman" w:hAnsi="Times New Roman" w:cs="Times New Roman"/>
+          <w:b/>
+          <w:bCs/>
+          <w:sz w:val="28"/>
+          <w:szCs w:val="28"/>
+        </w:rPr>
+      </w:pPr>
+    </w:p>
+    <w:p>
+      <w:pPr>
+        <w:spacing w:line="360" w:lineRule="auto"/>
+        <w:jc w:val="both"/>
         <w:rPr>
           <w:rFonts w:ascii="Times New Roman" w:hAnsi="Times New Roman" w:cs="Times New Roman"/>
           <w:b/>
@@ -517,670 +1177,8 @@
           <w:sz w:val="32"/>
           <w:szCs w:val="32"/>
         </w:rPr>
-        <w:t>Background</w:t>
-      </w:r>
-    </w:p>
-    <w:p>
-      <w:pPr>
-        <w:spacing w:line="360" w:lineRule="auto"/>
-        <w:jc w:val="both"/>
-        <w:rPr>
-          <w:rFonts w:ascii="Times New Roman" w:hAnsi="Times New Roman" w:cs="Times New Roman"/>
-          <w:sz w:val="28"/>
-          <w:szCs w:val="28"/>
-        </w:rPr>
-      </w:pPr>
-      <w:r>
-        <w:rPr>
-          <w:rFonts w:ascii="Times New Roman" w:hAnsi="Times New Roman" w:cs="Times New Roman"/>
-          <w:sz w:val="28"/>
-          <w:szCs w:val="28"/>
-        </w:rPr>
-        <w:t>The airline industry generates enormous volumes of operational and transactional data every day. Information related to flight schedules, bookings, passengers, ticket payments, airline performance, and travel routes contains valuable business intelligence that can help organizations improve customer satisfaction and operational efficiency.</w:t>
-      </w:r>
-    </w:p>
-    <w:p>
-      <w:pPr>
-        <w:spacing w:line="360" w:lineRule="auto"/>
-        <w:jc w:val="both"/>
-        <w:rPr>
-          <w:rFonts w:ascii="Times New Roman" w:hAnsi="Times New Roman" w:cs="Times New Roman"/>
-          <w:sz w:val="28"/>
-          <w:szCs w:val="28"/>
-        </w:rPr>
-      </w:pPr>
-      <w:r>
-        <w:rPr>
-          <w:rFonts w:ascii="Times New Roman" w:hAnsi="Times New Roman" w:cs="Times New Roman"/>
-          <w:sz w:val="28"/>
-          <w:szCs w:val="28"/>
-        </w:rPr>
-        <w:t>However, raw data alone cannot support strategic decisions because it often contains inconsistencies, duplicates, missing values, and multiple disconnected tables. Therefore, organizations require a structured data pipeline that transforms raw information into reliable analytical datasets.</w:t>
-      </w:r>
-    </w:p>
-    <w:p>
-      <w:pPr>
-        <w:spacing w:line="360" w:lineRule="auto"/>
-        <w:jc w:val="both"/>
-        <w:rPr>
-          <w:rFonts w:ascii="Times New Roman" w:hAnsi="Times New Roman" w:cs="Times New Roman"/>
-          <w:sz w:val="28"/>
-          <w:szCs w:val="28"/>
-        </w:rPr>
-      </w:pPr>
-      <w:r>
-        <w:rPr>
-          <w:rFonts w:ascii="Times New Roman" w:hAnsi="Times New Roman" w:cs="Times New Roman"/>
-          <w:sz w:val="28"/>
-          <w:szCs w:val="28"/>
-        </w:rPr>
-        <w:t>This project addresses that challenge by building an end-to-end analytics solution for ASG Airlines, integrating data engineering, SQL analytics, and Power BI visualization into a single workflow.</w:t>
-      </w:r>
-    </w:p>
-    <w:p>
-      <w:pPr>
-        <w:spacing w:line="360" w:lineRule="auto"/>
-        <w:jc w:val="both"/>
-        <w:rPr>
-          <w:rFonts w:ascii="Times New Roman" w:hAnsi="Times New Roman" w:cs="Times New Roman"/>
-          <w:sz w:val="28"/>
-          <w:szCs w:val="28"/>
-        </w:rPr>
-      </w:pPr>
-    </w:p>
-    <w:p>
-      <w:pPr>
-        <w:spacing w:line="360" w:lineRule="auto"/>
-        <w:jc w:val="both"/>
-        <w:rPr>
-          <w:rFonts w:ascii="Times New Roman" w:hAnsi="Times New Roman" w:cs="Times New Roman"/>
-          <w:b/>
-          <w:bCs/>
-          <w:sz w:val="28"/>
-          <w:szCs w:val="28"/>
-        </w:rPr>
-      </w:pPr>
-      <w:r>
-        <w:rPr>
-          <w:rFonts w:ascii="Times New Roman" w:hAnsi="Times New Roman" w:cs="Times New Roman"/>
-          <w:b/>
-          <w:bCs/>
-          <w:sz w:val="28"/>
-          <w:szCs w:val="28"/>
-        </w:rPr>
-        <w:t xml:space="preserve">1.2 </w:t>
-      </w:r>
-      <w:r>
-        <w:rPr>
-          <w:rFonts w:ascii="Times New Roman" w:hAnsi="Times New Roman" w:cs="Times New Roman"/>
-          <w:b/>
-          <w:bCs/>
-          <w:sz w:val="28"/>
-          <w:szCs w:val="28"/>
-        </w:rPr>
-        <w:t>Problem Statement</w:t>
-      </w:r>
-    </w:p>
-    <w:p>
-      <w:pPr>
-        <w:spacing w:line="360" w:lineRule="auto"/>
-        <w:jc w:val="both"/>
-        <w:rPr>
-          <w:rFonts w:ascii="Times New Roman" w:hAnsi="Times New Roman" w:cs="Times New Roman"/>
-          <w:sz w:val="28"/>
-          <w:szCs w:val="28"/>
-        </w:rPr>
-      </w:pPr>
-      <w:r>
-        <w:rPr>
-          <w:rFonts w:ascii="Times New Roman" w:hAnsi="Times New Roman" w:cs="Times New Roman"/>
-          <w:sz w:val="28"/>
-          <w:szCs w:val="28"/>
-        </w:rPr>
-        <w:t>The airline management team lacked a centralized analytical platform capable of answering critical business questions such as:</w:t>
-      </w:r>
-    </w:p>
-    <w:p>
-      <w:pPr>
-        <w:numPr>
-          <w:ilvl w:val="0"/>
-          <w:numId w:val="2"/>
-        </w:numPr>
-        <w:spacing w:line="360" w:lineRule="auto"/>
-        <w:jc w:val="both"/>
-        <w:rPr>
-          <w:rFonts w:ascii="Times New Roman" w:hAnsi="Times New Roman" w:cs="Times New Roman"/>
-          <w:sz w:val="28"/>
-          <w:szCs w:val="28"/>
-        </w:rPr>
-      </w:pPr>
-      <w:r>
-        <w:rPr>
-          <w:rFonts w:ascii="Times New Roman" w:hAnsi="Times New Roman" w:cs="Times New Roman"/>
-          <w:sz w:val="28"/>
-          <w:szCs w:val="28"/>
-        </w:rPr>
-        <w:t>Which airlines generate the highest revenue?</w:t>
-      </w:r>
-    </w:p>
-    <w:p>
-      <w:pPr>
-        <w:numPr>
-          <w:ilvl w:val="0"/>
-          <w:numId w:val="2"/>
-        </w:numPr>
-        <w:spacing w:line="360" w:lineRule="auto"/>
-        <w:jc w:val="both"/>
-        <w:rPr>
-          <w:rFonts w:ascii="Times New Roman" w:hAnsi="Times New Roman" w:cs="Times New Roman"/>
-          <w:sz w:val="28"/>
-          <w:szCs w:val="28"/>
-        </w:rPr>
-      </w:pPr>
-      <w:r>
-        <w:rPr>
-          <w:rFonts w:ascii="Times New Roman" w:hAnsi="Times New Roman" w:cs="Times New Roman"/>
-          <w:sz w:val="28"/>
-          <w:szCs w:val="28"/>
-        </w:rPr>
-        <w:t>What are the busiest departure cities?</w:t>
-      </w:r>
-    </w:p>
-    <w:p>
-      <w:pPr>
-        <w:numPr>
-          <w:ilvl w:val="0"/>
-          <w:numId w:val="2"/>
-        </w:numPr>
-        <w:spacing w:line="360" w:lineRule="auto"/>
-        <w:jc w:val="both"/>
-        <w:rPr>
-          <w:rFonts w:ascii="Times New Roman" w:hAnsi="Times New Roman" w:cs="Times New Roman"/>
-          <w:sz w:val="28"/>
-          <w:szCs w:val="28"/>
-        </w:rPr>
-      </w:pPr>
-      <w:r>
-        <w:rPr>
-          <w:rFonts w:ascii="Times New Roman" w:hAnsi="Times New Roman" w:cs="Times New Roman"/>
-          <w:sz w:val="28"/>
-          <w:szCs w:val="28"/>
-        </w:rPr>
-        <w:t>How does monthly revenue fluctuate?</w:t>
-      </w:r>
-    </w:p>
-    <w:p>
-      <w:pPr>
-        <w:numPr>
-          <w:ilvl w:val="0"/>
-          <w:numId w:val="2"/>
-        </w:numPr>
-        <w:spacing w:line="360" w:lineRule="auto"/>
-        <w:jc w:val="both"/>
-        <w:rPr>
-          <w:rFonts w:ascii="Times New Roman" w:hAnsi="Times New Roman" w:cs="Times New Roman"/>
-          <w:sz w:val="28"/>
-          <w:szCs w:val="28"/>
-        </w:rPr>
-      </w:pPr>
-      <w:r>
-        <w:rPr>
-          <w:rFonts w:ascii="Times New Roman" w:hAnsi="Times New Roman" w:cs="Times New Roman"/>
-          <w:sz w:val="28"/>
-          <w:szCs w:val="28"/>
-        </w:rPr>
-        <w:t>What is the passenger demographic distribution?</w:t>
-      </w:r>
-    </w:p>
-    <w:p>
-      <w:pPr>
-        <w:numPr>
-          <w:ilvl w:val="0"/>
-          <w:numId w:val="2"/>
-        </w:numPr>
-        <w:spacing w:line="360" w:lineRule="auto"/>
-        <w:jc w:val="both"/>
-        <w:rPr>
-          <w:rFonts w:ascii="Times New Roman" w:hAnsi="Times New Roman" w:cs="Times New Roman"/>
-          <w:sz w:val="28"/>
-          <w:szCs w:val="28"/>
-        </w:rPr>
-      </w:pPr>
-      <w:r>
-        <w:rPr>
-          <w:rFonts w:ascii="Times New Roman" w:hAnsi="Times New Roman" w:cs="Times New Roman"/>
-          <w:sz w:val="28"/>
-          <w:szCs w:val="28"/>
-        </w:rPr>
-        <w:t>What percentage of flights operate overnight?</w:t>
-      </w:r>
-    </w:p>
-    <w:p>
-      <w:pPr>
-        <w:numPr>
-          <w:ilvl w:val="0"/>
-          <w:numId w:val="2"/>
-        </w:numPr>
-        <w:spacing w:line="360" w:lineRule="auto"/>
-        <w:jc w:val="both"/>
-        <w:rPr>
-          <w:rFonts w:ascii="Times New Roman" w:hAnsi="Times New Roman" w:cs="Times New Roman"/>
-          <w:sz w:val="28"/>
-          <w:szCs w:val="28"/>
-        </w:rPr>
-      </w:pPr>
-      <w:r>
-        <w:rPr>
-          <w:rFonts w:ascii="Times New Roman" w:hAnsi="Times New Roman" w:cs="Times New Roman"/>
-          <w:sz w:val="28"/>
-          <w:szCs w:val="28"/>
-        </w:rPr>
-        <w:t>Which payment method contributes the most revenue?</w:t>
-      </w:r>
-    </w:p>
-    <w:p>
-      <w:pPr>
-        <w:spacing w:line="360" w:lineRule="auto"/>
-        <w:jc w:val="both"/>
-        <w:rPr>
-          <w:rFonts w:ascii="Times New Roman" w:hAnsi="Times New Roman" w:cs="Times New Roman"/>
-          <w:sz w:val="28"/>
-          <w:szCs w:val="28"/>
-        </w:rPr>
-      </w:pPr>
-      <w:r>
-        <w:rPr>
-          <w:rFonts w:ascii="Times New Roman" w:hAnsi="Times New Roman" w:cs="Times New Roman"/>
-          <w:sz w:val="28"/>
-          <w:szCs w:val="28"/>
-        </w:rPr>
-        <w:lastRenderedPageBreak/>
-        <w:t>Manual analysis using Excel was time-consuming and inefficient. Hence, an automated analytics platform was required.</w:t>
-      </w:r>
-    </w:p>
-    <w:p>
-      <w:pPr>
-        <w:spacing w:line="360" w:lineRule="auto"/>
-        <w:jc w:val="both"/>
-        <w:rPr>
-          <w:rFonts w:ascii="Times New Roman" w:hAnsi="Times New Roman" w:cs="Times New Roman"/>
-          <w:b/>
-          <w:bCs/>
-          <w:sz w:val="28"/>
-          <w:szCs w:val="28"/>
-        </w:rPr>
-      </w:pPr>
-    </w:p>
-    <w:p>
-      <w:pPr>
-        <w:spacing w:line="360" w:lineRule="auto"/>
-        <w:jc w:val="both"/>
-        <w:rPr>
-          <w:rFonts w:ascii="Times New Roman" w:hAnsi="Times New Roman" w:cs="Times New Roman"/>
-          <w:b/>
-          <w:bCs/>
-          <w:sz w:val="28"/>
-          <w:szCs w:val="28"/>
-        </w:rPr>
-      </w:pPr>
-      <w:r>
-        <w:rPr>
-          <w:rFonts w:ascii="Times New Roman" w:hAnsi="Times New Roman" w:cs="Times New Roman"/>
-          <w:b/>
-          <w:bCs/>
-          <w:sz w:val="28"/>
-          <w:szCs w:val="28"/>
-        </w:rPr>
-        <w:t xml:space="preserve">1.3 </w:t>
-      </w:r>
-      <w:r>
-        <w:rPr>
-          <w:rFonts w:ascii="Times New Roman" w:hAnsi="Times New Roman" w:cs="Times New Roman"/>
-          <w:b/>
-          <w:bCs/>
-          <w:sz w:val="28"/>
-          <w:szCs w:val="28"/>
-        </w:rPr>
-        <w:t>Project Objectives</w:t>
-      </w:r>
-    </w:p>
-    <w:p>
-      <w:pPr>
-        <w:spacing w:line="360" w:lineRule="auto"/>
-        <w:jc w:val="both"/>
-        <w:rPr>
-          <w:rFonts w:ascii="Times New Roman" w:hAnsi="Times New Roman" w:cs="Times New Roman"/>
-          <w:sz w:val="28"/>
-          <w:szCs w:val="28"/>
-        </w:rPr>
-      </w:pPr>
-      <w:r>
-        <w:rPr>
-          <w:rFonts w:ascii="Times New Roman" w:hAnsi="Times New Roman" w:cs="Times New Roman"/>
-          <w:sz w:val="28"/>
-          <w:szCs w:val="28"/>
-        </w:rPr>
-        <w:t>The primary objectives of this project are:</w:t>
-      </w:r>
-    </w:p>
-    <w:p>
-      <w:pPr>
-        <w:numPr>
-          <w:ilvl w:val="0"/>
-          <w:numId w:val="3"/>
-        </w:numPr>
-        <w:spacing w:line="360" w:lineRule="auto"/>
-        <w:jc w:val="both"/>
-        <w:rPr>
-          <w:rFonts w:ascii="Times New Roman" w:hAnsi="Times New Roman" w:cs="Times New Roman"/>
-          <w:sz w:val="28"/>
-          <w:szCs w:val="28"/>
-        </w:rPr>
-      </w:pPr>
-      <w:r>
-        <w:rPr>
-          <w:rFonts w:ascii="Times New Roman" w:hAnsi="Times New Roman" w:cs="Times New Roman"/>
-          <w:sz w:val="28"/>
-          <w:szCs w:val="28"/>
-        </w:rPr>
-        <w:t>Design an end-to-end ETL pipeline.</w:t>
-      </w:r>
-    </w:p>
-    <w:p>
-      <w:pPr>
-        <w:numPr>
-          <w:ilvl w:val="0"/>
-          <w:numId w:val="3"/>
-        </w:numPr>
-        <w:spacing w:line="360" w:lineRule="auto"/>
-        <w:jc w:val="both"/>
-        <w:rPr>
-          <w:rFonts w:ascii="Times New Roman" w:hAnsi="Times New Roman" w:cs="Times New Roman"/>
-          <w:sz w:val="28"/>
-          <w:szCs w:val="28"/>
-        </w:rPr>
-      </w:pPr>
-      <w:r>
-        <w:rPr>
-          <w:rFonts w:ascii="Times New Roman" w:hAnsi="Times New Roman" w:cs="Times New Roman"/>
-          <w:sz w:val="28"/>
-          <w:szCs w:val="28"/>
-        </w:rPr>
-        <w:t>Clean and validate airline datasets using Python.</w:t>
-      </w:r>
-    </w:p>
-    <w:p>
-      <w:pPr>
-        <w:numPr>
-          <w:ilvl w:val="0"/>
-          <w:numId w:val="3"/>
-        </w:numPr>
-        <w:spacing w:line="360" w:lineRule="auto"/>
-        <w:jc w:val="both"/>
-        <w:rPr>
-          <w:rFonts w:ascii="Times New Roman" w:hAnsi="Times New Roman" w:cs="Times New Roman"/>
-          <w:sz w:val="28"/>
-          <w:szCs w:val="28"/>
-        </w:rPr>
-      </w:pPr>
-      <w:r>
-        <w:rPr>
-          <w:rFonts w:ascii="Times New Roman" w:hAnsi="Times New Roman" w:cs="Times New Roman"/>
-          <w:sz w:val="28"/>
-          <w:szCs w:val="28"/>
-        </w:rPr>
-        <w:t>Build a normalized SQL database.</w:t>
-      </w:r>
-    </w:p>
-    <w:p>
-      <w:pPr>
-        <w:numPr>
-          <w:ilvl w:val="0"/>
-          <w:numId w:val="3"/>
-        </w:numPr>
-        <w:spacing w:line="360" w:lineRule="auto"/>
-        <w:jc w:val="both"/>
-        <w:rPr>
-          <w:rFonts w:ascii="Times New Roman" w:hAnsi="Times New Roman" w:cs="Times New Roman"/>
-          <w:sz w:val="28"/>
-          <w:szCs w:val="28"/>
-        </w:rPr>
-      </w:pPr>
-      <w:r>
-        <w:rPr>
-          <w:rFonts w:ascii="Times New Roman" w:hAnsi="Times New Roman" w:cs="Times New Roman"/>
-          <w:sz w:val="28"/>
-          <w:szCs w:val="28"/>
-        </w:rPr>
-        <w:t>Generate business KPIs using SQL and DAX.</w:t>
-      </w:r>
-    </w:p>
-    <w:p>
-      <w:pPr>
-        <w:numPr>
-          <w:ilvl w:val="0"/>
-          <w:numId w:val="3"/>
-        </w:numPr>
-        <w:spacing w:line="360" w:lineRule="auto"/>
-        <w:jc w:val="both"/>
-        <w:rPr>
-          <w:rFonts w:ascii="Times New Roman" w:hAnsi="Times New Roman" w:cs="Times New Roman"/>
-          <w:sz w:val="28"/>
-          <w:szCs w:val="28"/>
-        </w:rPr>
-      </w:pPr>
-      <w:r>
-        <w:rPr>
-          <w:rFonts w:ascii="Times New Roman" w:hAnsi="Times New Roman" w:cs="Times New Roman"/>
-          <w:sz w:val="28"/>
-          <w:szCs w:val="28"/>
-        </w:rPr>
-        <w:t xml:space="preserve">Implement Star Schema data </w:t>
-      </w:r>
-      <w:proofErr w:type="spellStart"/>
-      <w:r>
-        <w:rPr>
-          <w:rFonts w:ascii="Times New Roman" w:hAnsi="Times New Roman" w:cs="Times New Roman"/>
-          <w:sz w:val="28"/>
-          <w:szCs w:val="28"/>
-        </w:rPr>
-        <w:t>modeling</w:t>
-      </w:r>
-      <w:proofErr w:type="spellEnd"/>
-      <w:r>
-        <w:rPr>
-          <w:rFonts w:ascii="Times New Roman" w:hAnsi="Times New Roman" w:cs="Times New Roman"/>
-          <w:sz w:val="28"/>
-          <w:szCs w:val="28"/>
-        </w:rPr>
-        <w:t>.</w:t>
-      </w:r>
-    </w:p>
-    <w:p>
-      <w:pPr>
-        <w:numPr>
-          <w:ilvl w:val="0"/>
-          <w:numId w:val="3"/>
-        </w:numPr>
-        <w:spacing w:line="360" w:lineRule="auto"/>
-        <w:jc w:val="both"/>
-        <w:rPr>
-          <w:rFonts w:ascii="Times New Roman" w:hAnsi="Times New Roman" w:cs="Times New Roman"/>
-          <w:sz w:val="28"/>
-          <w:szCs w:val="28"/>
-        </w:rPr>
-      </w:pPr>
-      <w:r>
-        <w:rPr>
-          <w:rFonts w:ascii="Times New Roman" w:hAnsi="Times New Roman" w:cs="Times New Roman"/>
-          <w:sz w:val="28"/>
-          <w:szCs w:val="28"/>
-        </w:rPr>
-        <w:t>Develop interactive Power BI dashboards.</w:t>
-      </w:r>
-    </w:p>
-    <w:p>
-      <w:pPr>
-        <w:numPr>
-          <w:ilvl w:val="0"/>
-          <w:numId w:val="3"/>
-        </w:numPr>
-        <w:spacing w:line="360" w:lineRule="auto"/>
-        <w:jc w:val="both"/>
-        <w:rPr>
-          <w:rFonts w:ascii="Times New Roman" w:hAnsi="Times New Roman" w:cs="Times New Roman"/>
-          <w:sz w:val="28"/>
-          <w:szCs w:val="28"/>
-        </w:rPr>
-      </w:pPr>
-      <w:r>
-        <w:rPr>
-          <w:rFonts w:ascii="Times New Roman" w:hAnsi="Times New Roman" w:cs="Times New Roman"/>
-          <w:sz w:val="28"/>
-          <w:szCs w:val="28"/>
-        </w:rPr>
-        <w:t>Enable slicers, navigation, and drill-down analysis.</w:t>
-      </w:r>
-    </w:p>
-    <w:p>
-      <w:pPr>
-        <w:numPr>
-          <w:ilvl w:val="0"/>
-          <w:numId w:val="3"/>
-        </w:numPr>
-        <w:spacing w:line="360" w:lineRule="auto"/>
-        <w:jc w:val="both"/>
-        <w:rPr>
-          <w:rFonts w:ascii="Times New Roman" w:hAnsi="Times New Roman" w:cs="Times New Roman"/>
-          <w:sz w:val="28"/>
-          <w:szCs w:val="28"/>
-        </w:rPr>
-      </w:pPr>
-      <w:r>
-        <w:rPr>
-          <w:rFonts w:ascii="Times New Roman" w:hAnsi="Times New Roman" w:cs="Times New Roman"/>
-          <w:sz w:val="28"/>
-          <w:szCs w:val="28"/>
-        </w:rPr>
-        <w:t>Produce executive-level business reports for decision making.</w:t>
-      </w:r>
-    </w:p>
-    <w:p>
-      <w:pPr>
-        <w:spacing w:line="360" w:lineRule="auto"/>
-        <w:jc w:val="both"/>
-        <w:rPr>
-          <w:rFonts w:ascii="Times New Roman" w:hAnsi="Times New Roman" w:cs="Times New Roman"/>
-          <w:sz w:val="28"/>
-          <w:szCs w:val="28"/>
-        </w:rPr>
-      </w:pPr>
-    </w:p>
-    <w:p>
-      <w:pPr>
-        <w:spacing w:line="360" w:lineRule="auto"/>
-        <w:jc w:val="both"/>
-        <w:rPr>
-          <w:rFonts w:ascii="Times New Roman" w:hAnsi="Times New Roman" w:cs="Times New Roman"/>
-          <w:sz w:val="28"/>
-          <w:szCs w:val="28"/>
-        </w:rPr>
-      </w:pPr>
-    </w:p>
-    <w:p>
-      <w:pPr>
-        <w:spacing w:line="360" w:lineRule="auto"/>
-        <w:jc w:val="both"/>
-        <w:rPr>
-          <w:rFonts w:ascii="Times New Roman" w:hAnsi="Times New Roman" w:cs="Times New Roman"/>
-          <w:sz w:val="28"/>
-          <w:szCs w:val="28"/>
-        </w:rPr>
-      </w:pPr>
-    </w:p>
-    <w:p>
-      <w:pPr>
-        <w:spacing w:line="360" w:lineRule="auto"/>
-        <w:jc w:val="both"/>
-        <w:rPr>
-          <w:rFonts w:ascii="Times New Roman" w:hAnsi="Times New Roman" w:cs="Times New Roman"/>
-          <w:sz w:val="28"/>
-          <w:szCs w:val="28"/>
-        </w:rPr>
-      </w:pPr>
-    </w:p>
-    <w:p>
-      <w:pPr>
-        <w:spacing w:line="360" w:lineRule="auto"/>
-        <w:jc w:val="both"/>
-        <w:rPr>
-          <w:rFonts w:ascii="Times New Roman" w:hAnsi="Times New Roman" w:cs="Times New Roman"/>
-          <w:sz w:val="28"/>
-          <w:szCs w:val="28"/>
-        </w:rPr>
-      </w:pPr>
-    </w:p>
-    <w:p>
-      <w:pPr>
-        <w:spacing w:line="360" w:lineRule="auto"/>
-        <w:jc w:val="both"/>
-        <w:rPr>
-          <w:rFonts w:ascii="Times New Roman" w:hAnsi="Times New Roman" w:cs="Times New Roman"/>
-          <w:sz w:val="28"/>
-          <w:szCs w:val="28"/>
-        </w:rPr>
-      </w:pPr>
-    </w:p>
-    <w:p>
-      <w:pPr>
-        <w:spacing w:line="360" w:lineRule="auto"/>
-        <w:jc w:val="both"/>
-        <w:rPr>
-          <w:rFonts w:ascii="Times New Roman" w:hAnsi="Times New Roman" w:cs="Times New Roman"/>
-          <w:sz w:val="28"/>
-          <w:szCs w:val="28"/>
-        </w:rPr>
-      </w:pPr>
-    </w:p>
-    <w:p>
-      <w:pPr>
-        <w:spacing w:line="360" w:lineRule="auto"/>
-        <w:jc w:val="both"/>
-        <w:rPr>
-          <w:rFonts w:ascii="Times New Roman" w:hAnsi="Times New Roman" w:cs="Times New Roman"/>
-          <w:sz w:val="28"/>
-          <w:szCs w:val="28"/>
-        </w:rPr>
-      </w:pPr>
-    </w:p>
-    <w:p>
-      <w:pPr>
-        <w:spacing w:line="360" w:lineRule="auto"/>
-        <w:jc w:val="both"/>
-        <w:rPr>
-          <w:rFonts w:ascii="Times New Roman" w:hAnsi="Times New Roman" w:cs="Times New Roman"/>
-          <w:sz w:val="28"/>
-          <w:szCs w:val="28"/>
-        </w:rPr>
-      </w:pPr>
-    </w:p>
-    <w:p>
-      <w:pPr>
-        <w:spacing w:line="360" w:lineRule="auto"/>
-        <w:jc w:val="both"/>
-        <w:rPr>
-          <w:rFonts w:ascii="Times New Roman" w:hAnsi="Times New Roman" w:cs="Times New Roman"/>
-          <w:b/>
-          <w:bCs/>
-          <w:sz w:val="28"/>
-          <w:szCs w:val="28"/>
-        </w:rPr>
-      </w:pPr>
-    </w:p>
-    <w:p>
-      <w:pPr>
-        <w:spacing w:line="360" w:lineRule="auto"/>
-        <w:jc w:val="both"/>
+      </w:pPr>
+      <w:r>
         <w:rPr>
           <w:rFonts w:ascii="Times New Roman" w:hAnsi="Times New Roman" w:cs="Times New Roman"/>
           <w:b/>
@@ -1188,7 +1186,17 @@
           <w:sz w:val="32"/>
           <w:szCs w:val="32"/>
         </w:rPr>
-      </w:pPr>
+        <w:t>2.</w:t>
+      </w:r>
+      <w:r>
+        <w:rPr>
+          <w:b/>
+          <w:bCs/>
+          <w:sz w:val="32"/>
+          <w:szCs w:val="32"/>
+        </w:rPr>
+        <w:t xml:space="preserve"> </w:t>
+      </w:r>
       <w:r>
         <w:rPr>
           <w:rFonts w:ascii="Times New Roman" w:hAnsi="Times New Roman" w:cs="Times New Roman"/>
@@ -1197,18 +1205,13 @@
           <w:sz w:val="32"/>
           <w:szCs w:val="32"/>
         </w:rPr>
-        <w:t>2.</w:t>
-      </w:r>
-      <w:r>
-        <w:rPr>
-          <w:b/>
-          <w:bCs/>
-          <w:sz w:val="32"/>
-          <w:szCs w:val="32"/>
-        </w:rPr>
-        <w:t xml:space="preserve"> </w:t>
-      </w:r>
-      <w:r>
+        <w:t>TOOLS &amp; TECHNOLOGIES USED</w:t>
+      </w:r>
+    </w:p>
+    <w:p>
+      <w:pPr>
+        <w:spacing w:line="360" w:lineRule="auto"/>
+        <w:jc w:val="both"/>
         <w:rPr>
           <w:rFonts w:ascii="Times New Roman" w:hAnsi="Times New Roman" w:cs="Times New Roman"/>
           <w:b/>
@@ -1216,13 +1219,8 @@
           <w:sz w:val="32"/>
           <w:szCs w:val="32"/>
         </w:rPr>
-        <w:t>TOOLS &amp; TECHNOLOGIES USED</w:t>
-      </w:r>
-    </w:p>
-    <w:p>
-      <w:pPr>
-        <w:spacing w:line="360" w:lineRule="auto"/>
-        <w:jc w:val="both"/>
+      </w:pPr>
+      <w:r>
         <w:rPr>
           <w:rFonts w:ascii="Times New Roman" w:hAnsi="Times New Roman" w:cs="Times New Roman"/>
           <w:b/>
@@ -1230,26 +1228,7 @@
           <w:sz w:val="32"/>
           <w:szCs w:val="32"/>
         </w:rPr>
-      </w:pPr>
-      <w:r>
-        <w:rPr>
-          <w:rFonts w:ascii="Times New Roman" w:hAnsi="Times New Roman" w:cs="Times New Roman"/>
-          <w:b/>
-          <w:bCs/>
-          <w:sz w:val="32"/>
-          <w:szCs w:val="32"/>
-        </w:rPr>
-        <w:t xml:space="preserve">2.1 </w:t>
-      </w:r>
-      <w:r>
-        <w:rPr>
-          <w:rFonts w:ascii="Times New Roman" w:hAnsi="Times New Roman" w:cs="Times New Roman"/>
-          <w:b/>
-          <w:bCs/>
-          <w:sz w:val="32"/>
-          <w:szCs w:val="32"/>
-        </w:rPr>
-        <w:t>Technology Stack</w:t>
+        <w:t>2.1 Technology Stack</w:t>
       </w:r>
     </w:p>
     <w:tbl>
@@ -1922,44 +1901,26 @@
           <w:szCs w:val="32"/>
         </w:rPr>
         <w:lastRenderedPageBreak/>
-        <w:t xml:space="preserve">2.2 </w:t>
-      </w:r>
-      <w:r>
+        <w:t>2.2 Python Libraries Used</w:t>
+      </w:r>
+    </w:p>
+    <w:p>
+      <w:pPr>
+        <w:spacing w:line="360" w:lineRule="auto"/>
+        <w:jc w:val="both"/>
         <w:rPr>
           <w:rFonts w:ascii="Times New Roman" w:hAnsi="Times New Roman" w:cs="Times New Roman"/>
-          <w:b/>
-          <w:bCs/>
-          <w:sz w:val="32"/>
-          <w:szCs w:val="32"/>
-        </w:rPr>
-        <w:t>Python Libraries Used</w:t>
-      </w:r>
-    </w:p>
-    <w:p>
-      <w:pPr>
-        <w:spacing w:line="360" w:lineRule="auto"/>
-        <w:jc w:val="both"/>
+          <w:sz w:val="28"/>
+          <w:szCs w:val="28"/>
+        </w:rPr>
+      </w:pPr>
+      <w:r>
         <w:rPr>
           <w:rFonts w:ascii="Times New Roman" w:hAnsi="Times New Roman" w:cs="Times New Roman"/>
           <w:sz w:val="28"/>
           <w:szCs w:val="28"/>
         </w:rPr>
-      </w:pPr>
-      <w:r>
-        <w:rPr>
-          <w:rFonts w:ascii="Times New Roman" w:hAnsi="Times New Roman" w:cs="Times New Roman"/>
-          <w:sz w:val="28"/>
-          <w:szCs w:val="28"/>
-        </w:rPr>
-        <w:t xml:space="preserve">1. </w:t>
-      </w:r>
-      <w:r>
-        <w:rPr>
-          <w:rFonts w:ascii="Times New Roman" w:hAnsi="Times New Roman" w:cs="Times New Roman"/>
-          <w:sz w:val="28"/>
-          <w:szCs w:val="28"/>
-        </w:rPr>
-        <w:t>Pandas</w:t>
+        <w:t>1. Pandas</w:t>
       </w:r>
     </w:p>
     <w:p>
@@ -2410,6 +2371,7 @@
       <w:r>
         <w:rPr>
           <w:rFonts w:ascii="Times New Roman" w:hAnsi="Times New Roman" w:cs="Times New Roman"/>
+          <w:noProof/>
           <w:sz w:val="28"/>
           <w:szCs w:val="28"/>
         </w:rPr>
@@ -2445,7 +2407,7 @@
                     <pic:cNvPicPr/>
                   </pic:nvPicPr>
                   <pic:blipFill>
-                    <a:blip r:embed="rId6">
+                    <a:blip r:embed="rId7">
                       <a:extLst>
                         <a:ext uri="{28A0092B-C50C-407E-A947-70E740481C1C}">
                           <a14:useLocalDpi xmlns:a14="http://schemas.microsoft.com/office/drawing/2010/main" val="0"/>
@@ -2987,15 +2949,7 @@
                 <w:sz w:val="32"/>
                 <w:szCs w:val="32"/>
               </w:rPr>
-              <w:t xml:space="preserve"> </w:t>
-            </w:r>
-            <w:r>
-              <w:rPr>
-                <w:rFonts w:ascii="Times" w:hAnsi="Times"/>
-                <w:sz w:val="32"/>
-                <w:szCs w:val="32"/>
-              </w:rPr>
-              <w:t>Interactive development of ETL pipeline</w:t>
+              <w:t xml:space="preserve"> Interactive development of ETL pipeline</w:t>
             </w:r>
           </w:p>
         </w:tc>
@@ -3639,7 +3593,7 @@
                     </pic:cNvPicPr>
                   </pic:nvPicPr>
                   <pic:blipFill>
-                    <a:blip r:embed="rId7">
+                    <a:blip r:embed="rId8">
                       <a:extLst>
                         <a:ext uri="{28A0092B-C50C-407E-A947-70E740481C1C}">
                           <a14:useLocalDpi xmlns:a14="http://schemas.microsoft.com/office/drawing/2010/main" val="0"/>
@@ -4367,7 +4321,7 @@
                     </pic:cNvPicPr>
                   </pic:nvPicPr>
                   <pic:blipFill>
-                    <a:blip r:embed="rId8">
+                    <a:blip r:embed="rId9">
                       <a:extLst>
                         <a:ext uri="{28A0092B-C50C-407E-A947-70E740481C1C}">
                           <a14:useLocalDpi xmlns:a14="http://schemas.microsoft.com/office/drawing/2010/main" val="0"/>
@@ -8093,6 +8047,7 @@
       <w:r>
         <w:rPr>
           <w:rFonts w:ascii="Times" w:hAnsi="Times"/>
+          <w:noProof/>
           <w:sz w:val="28"/>
           <w:szCs w:val="28"/>
         </w:rPr>
@@ -8112,7 +8067,7 @@
                     <pic:cNvPicPr/>
                   </pic:nvPicPr>
                   <pic:blipFill>
-                    <a:blip r:embed="rId9"/>
+                    <a:blip r:embed="rId10"/>
                     <a:stretch>
                       <a:fillRect/>
                     </a:stretch>
@@ -12050,6 +12005,7 @@
           <w:rFonts w:ascii="Times" w:hAnsi="Times"/>
           <w:b/>
           <w:bCs/>
+          <w:noProof/>
           <w:sz w:val="28"/>
           <w:szCs w:val="28"/>
         </w:rPr>
@@ -12069,7 +12025,7 @@
                     <pic:cNvPicPr/>
                   </pic:nvPicPr>
                   <pic:blipFill>
-                    <a:blip r:embed="rId10"/>
+                    <a:blip r:embed="rId11"/>
                     <a:stretch>
                       <a:fillRect/>
                     </a:stretch>
@@ -12389,6 +12345,7 @@
           <w:rFonts w:ascii="Times" w:hAnsi="Times"/>
           <w:b/>
           <w:bCs/>
+          <w:noProof/>
           <w:sz w:val="28"/>
           <w:szCs w:val="28"/>
         </w:rPr>
@@ -12408,7 +12365,7 @@
                     <pic:cNvPicPr/>
                   </pic:nvPicPr>
                   <pic:blipFill>
-                    <a:blip r:embed="rId11"/>
+                    <a:blip r:embed="rId12"/>
                     <a:stretch>
                       <a:fillRect/>
                     </a:stretch>
@@ -12705,6 +12662,7 @@
           <w:rFonts w:ascii="Times" w:hAnsi="Times"/>
           <w:b/>
           <w:bCs/>
+          <w:noProof/>
           <w:sz w:val="28"/>
           <w:szCs w:val="28"/>
         </w:rPr>
@@ -12724,7 +12682,7 @@
                     <pic:cNvPicPr/>
                   </pic:nvPicPr>
                   <pic:blipFill>
-                    <a:blip r:embed="rId12"/>
+                    <a:blip r:embed="rId13"/>
                     <a:stretch>
                       <a:fillRect/>
                     </a:stretch>
@@ -13000,6 +12958,7 @@
           <w:rFonts w:ascii="Times" w:hAnsi="Times"/>
           <w:b/>
           <w:bCs/>
+          <w:noProof/>
           <w:sz w:val="32"/>
           <w:szCs w:val="32"/>
         </w:rPr>
@@ -13019,7 +12978,7 @@
                     <pic:cNvPicPr/>
                   </pic:nvPicPr>
                   <pic:blipFill>
-                    <a:blip r:embed="rId13"/>
+                    <a:blip r:embed="rId14"/>
                     <a:stretch>
                       <a:fillRect/>
                     </a:stretch>
@@ -13340,6 +13299,7 @@
           <w:rFonts w:ascii="Times" w:hAnsi="Times"/>
           <w:b/>
           <w:bCs/>
+          <w:noProof/>
           <w:sz w:val="32"/>
           <w:szCs w:val="32"/>
         </w:rPr>
@@ -13359,7 +13319,7 @@
                     <pic:cNvPicPr/>
                   </pic:nvPicPr>
                   <pic:blipFill>
-                    <a:blip r:embed="rId14"/>
+                    <a:blip r:embed="rId15"/>
                     <a:stretch>
                       <a:fillRect/>
                     </a:stretch>
@@ -19047,6 +19007,7 @@
   <w:style w:type="character" w:default="1" w:styleId="DefaultParagraphFont">
     <w:name w:val="Default Paragraph Font"/>
     <w:uiPriority w:val="1"/>
+    <w:semiHidden/>
     <w:unhideWhenUsed/>
   </w:style>
   <w:style w:type="table" w:default="1" w:styleId="TableNormal">

</xml_diff>